<commit_message>
docs: adopt 2D-only design and Python PySide6 direction
</commit_message>
<xml_diff>
--- a/docs/game-design-v0.1.ko.docx
+++ b/docs/game-design-v0.1.ko.docx
@@ -232,7 +232,7 @@
               <w:pStyle w:val="TableText"/>
             </w:pPr>
             <w:r>
-              <w:t>아침 햇빛은 추가 보너스, 손상은 회복 가능, 테라리움 보관 후 관리 면제, 첫 출시 실시간 3D 축소</w:t>
+              <w:t>아침 햇빛은 추가 보너스, 손상은 회복 가능, 테라리움 보관 후 관리 면제, 2D 전용 그래픽</w:t>
             </w:r>
           </w:p>
         </w:tc>
@@ -265,7 +265,7 @@
               <w:pStyle w:val="TableText"/>
             </w:pPr>
             <w:r>
-              <w:t>아침 접속 의무 유지 여부, 실제 3D 적용 범위, 꽃꽂이 출시 포함 여부, 유료 판매 방식</w:t>
+              <w:t>아침 접속 의무 유지 여부, 꽃꽂이 출시 포함 여부, 유료 판매 방식</w:t>
             </w:r>
           </w:p>
         </w:tc>
@@ -2536,7 +2536,7 @@
     </w:p>
     <w:p>
       <w:r>
-        <w:t>Godot 4.x 안정 버전 + GDScript를 우선 후보로 제안한다. 작은 네이티브 창, 2D UI, 식물 상태와 저장 중심으로 구현한다. 공식 Window 문서는 테두리 없는 창·최상단 표시·배경 투명 기능을 제공한다. 다만 이것이 모든 Windows 환경의 클릭 통과·전체 창 불투명도를 보장하지는 않으므로 첫 기술 검증 대상으로 둔다.</w:t>
+        <w:t>Python + PySide6로 전환하는 방향으로 개발한다. 작은 네이티브 창과 2D 이미지 UI, 식물 상태와 저장을 분리한다. 창 이동·최상단 표시·불투명도는 실제 Windows에서 먼저 검증한다. 현재 저장소의 Godot 시제품은 초기 구현 기록으로 보존하며, Python 버전은 아직 구현되지 않았다.</w:t>
       </w:r>
     </w:p>
     <w:p>
@@ -2545,13 +2545,13 @@
       </w:pPr>
       <w:hyperlink r:id="rId12">
         <w:r>
-          <w:t>기술 근거: Godot 공식 Window 문서 (2026.09.08 확인)</w:t>
+          <w:t>기술 근거: Qt for Python 공식 QWidget 문서</w:t>
         </w:r>
       </w:hyperlink>
     </w:p>
     <w:p>
       <w:r>
-        <w:t>첫 시제품은 2D 식물과 입체감 있는 화분 이미지로 구성한다. 원안의 실시간 2D·3D 혼합을 축소하는 제안이며, 3D 회전이 핵심 경험으로 확인되면 화분·선반부터 제한적으로 적용한다.</w:t>
+        <w:t>꽃·화분·정원은 2D 이미지와 레이어로 구성한다. 성장 단계별 이미지 교체, 잎 흔들림, 물방울과 개화 효과를 사용한다. 꽃꽂이는 평면 위치·방향·앞뒤 순서를 조정한다. 모델링·실시간 조명·입체 카메라 회전은 제작 범위에서 제외한다.</w:t>
       </w:r>
     </w:p>
     <w:p>

</xml_diff>